<commit_message>
docs: set Zenodo DOI 10.5281/zenodo.20986298 for v1.0.3
Update CITATION.cff, README, manuscripts, submission DOCX, and workflow docs with the new version DOI assigned by Zenodo.

Co-authored-by: Cursor <cursoragent@cursor.com>
</commit_message>
<xml_diff>
--- a/04_Manuscripts/submission_package_IJEHR/CoverLetter_IJEHR_20260628.docx
+++ b/04_Manuscripts/submission_package_IJEHR/CoverLetter_IJEHR_20260628.docx
@@ -196,11 +196,7 @@
         <w:pStyle w:val="ListBullet"/>
       </w:pPr>
       <w:r>
-        <w:rPr>
-          <w:rFonts w:ascii="Times New Roman" w:hAnsi="Times New Roman"/>
-          <w:sz w:val="24"/>
-        </w:rPr>
-        <w:t>Data availability: NDB Open Data, MLIT National Land Numerical Information, e-Stat. Code and data: https://github.com/haruki00430/greenspace-mental-health-japan and https://doi.org/10.5281/zenodo.20951145.</w:t>
+        <w:t>Data availability: NDB Open Data, MLIT National Land Numerical Information, e-Stat. Code and data: https://github.com/haruki00430/greenspace-mental-health-japan and https://doi.org/10.5281/zenodo.20986298.</w:t>
       </w:r>
     </w:p>
     <w:p>

</xml_diff>